<commit_message>
Duty Officer portal: phone chat from live books, read-only, ledger-logged (task #44)
</commit_message>
<xml_diff>
--- a/BOT_PLAYBOOK.docx
+++ b/BOT_PLAYBOOK.docx
@@ -1022,6 +1022,16 @@
           <w:u w:val="single"/>
         </w:rPr>
         <w:t>these</w:t>
+      </w:r>
+      <w:r>
+        <w:rPr>
+          <w:b/>
+          <w:bCs/>
+          <w:sz w:val="40"/>
+          <w:szCs w:val="40"/>
+          <w:u w:val="single"/>
+        </w:rPr>
+        <w:t>)</w:t>
       </w:r>
     </w:p>
     <w:p>

</xml_diff>